<commit_message>
TC-40: Text alignment check (#37)
* TC-40: update project file

* TC-40: added text alignment check

* TC-40: fix test

* TC-40: mapping alignment names from English to Ukrainian

* TC-40: remove comments

* TC-40: refactoring regarding comments
</commit_message>
<xml_diff>
--- a/java-thesis-checker/src/test/resources/normal_style.docx
+++ b/java-thesis-checker/src/test/resources/normal_style.docx
@@ -4,17 +4,9 @@
   <w:body>
     <w:p>
       <w:pPr>
-        <w:jc w:val="center"/>
-        <w:rPr>
-          <w:b/>
-          <w:bCs/>
-        </w:rPr>
+        <w:pStyle w:val="Heading1"/>
       </w:pPr>
       <w:r>
-        <w:rPr>
-          <w:b/>
-          <w:bCs/>
-        </w:rPr>
         <w:t>РОЗДІЛ 1</w:t>
       </w:r>
     </w:p>
@@ -22,7 +14,7 @@
       <w:pPr>
         <w:pStyle w:val="Heading1"/>
         <w:rPr>
-          <w:lang w:val="en-US"/>
+          <w:lang w:val="ru-RU"/>
         </w:rPr>
       </w:pPr>
       <w:r>
@@ -32,7 +24,7 @@
     <w:p>
       <w:pPr>
         <w:rPr>
-          <w:lang w:val="en-US"/>
+          <w:lang w:val="ru-RU"/>
         </w:rPr>
       </w:pPr>
     </w:p>
@@ -54,7 +46,7 @@
       </w:r>
       <w:r>
         <w:rPr>
-          <w:lang w:val="en-US"/>
+          <w:lang w:val="ru-RU"/>
         </w:rPr>
         <w:t>.</w:t>
       </w:r>

</xml_diff>